<commit_message>
Convert data layer to SQLAlchemy ORM
Replace db.py/raw PyMySQL with models.py defining all 8 tables as model
classes with relationships and cascade rules. Routes now use ORM queries;
templates read related data through relationships. Same URLs, templates
and database schema. README and report updated to match.

Co-Authored-By: Claude Fable 5 <noreply@anthropic.com>
Claude-Session: https://claude.ai/code/session_013xPLnyFTSjbxMiATP4c7ND
</commit_message>
<xml_diff>
--- a/docs/Project_Documentation.docx
+++ b/docs/Project_Documentation.docx
@@ -594,25 +594,13 @@
           <w:bCs/>
           <w:b/>
         </w:rPr>
-        <w:t xml:space="preserve">PyMySQL</w:t>
-      </w:r>
-      <w:r>
-        <w:t xml:space="preserve">,</w:t>
-      </w:r>
-      <w:r>
-        <w:t xml:space="preserve"> </w:t>
+        <w:t xml:space="preserve">SQLAlchemy</w:t>
       </w:r>
       <w:r>
         <w:rPr>
           <w:bCs/>
           <w:b/>
         </w:rPr>
-        <w:t xml:space="preserve">HTML</w:t>
-      </w:r>
-      <w:r>
-        <w:t xml:space="preserve">, and</w:t>
-      </w:r>
-      <w:r>
         <w:t xml:space="preserve"> </w:t>
       </w:r>
       <w:r>
@@ -620,16 +608,13 @@
           <w:bCs/>
           <w:b/>
         </w:rPr>
-        <w:t xml:space="preserve">CSS</w:t>
-      </w:r>
-      <w:r>
-        <w:t xml:space="preserve">. All database operations are written as raw SQL</w:t>
-      </w:r>
-      <w:r>
-        <w:t xml:space="preserve"> </w:t>
-      </w:r>
-      <w:r>
-        <w:t xml:space="preserve">queries demonstrating full</w:t>
+        <w:t xml:space="preserve">ORM</w:t>
+      </w:r>
+      <w:r>
+        <w:t xml:space="preserve"> </w:t>
+      </w:r>
+      <w:r>
+        <w:t xml:space="preserve">(with PyMySQL),</w:t>
       </w:r>
       <w:r>
         <w:t xml:space="preserve"> </w:t>
@@ -639,25 +624,51 @@
           <w:bCs/>
           <w:b/>
         </w:rPr>
+        <w:t xml:space="preserve">HTML</w:t>
+      </w:r>
+      <w:r>
+        <w:t xml:space="preserve">, and</w:t>
+      </w:r>
+      <w:r>
+        <w:t xml:space="preserve"> </w:t>
+      </w:r>
+      <w:r>
+        <w:rPr>
+          <w:bCs/>
+          <w:b/>
+        </w:rPr>
+        <w:t xml:space="preserve">CSS</w:t>
+      </w:r>
+      <w:r>
+        <w:t xml:space="preserve">. Every database table is mapped</w:t>
+      </w:r>
+      <w:r>
+        <w:t xml:space="preserve"> </w:t>
+      </w:r>
+      <w:r>
+        <w:t xml:space="preserve">to a Python model class, and all database operations demonstrate full</w:t>
+      </w:r>
+      <w:r>
+        <w:t xml:space="preserve"> </w:t>
+      </w:r>
+      <w:r>
+        <w:rPr>
+          <w:bCs/>
+          <w:b/>
+        </w:rPr>
         <w:t xml:space="preserve">CRUD</w:t>
       </w:r>
       <w:r>
         <w:t xml:space="preserve"> </w:t>
       </w:r>
       <w:r>
-        <w:t xml:space="preserve">(Create, Read, Update, Delete)</w:t>
-      </w:r>
-      <w:r>
-        <w:t xml:space="preserve"> </w:t>
-      </w:r>
-      <w:r>
-        <w:t xml:space="preserve">functionality, with parameterized queries for security and hashed password</w:t>
-      </w:r>
-      <w:r>
-        <w:t xml:space="preserve"> </w:t>
-      </w:r>
-      <w:r>
-        <w:t xml:space="preserve">storage.</w:t>
+        <w:t xml:space="preserve">(Create, Read, Update, Delete) functionality through the ORM, with</w:t>
+      </w:r>
+      <w:r>
+        <w:t xml:space="preserve"> </w:t>
+      </w:r>
+      <w:r>
+        <w:t xml:space="preserve">hashed password storage.</w:t>
       </w:r>
     </w:p>
     <w:p>
@@ -1722,7 +1733,7 @@
         <w:pStyle w:val="Compact"/>
       </w:pPr>
       <w:r>
-        <w:t xml:space="preserve">To implement all CRUD operations (Create, Read, Update, Delete) using raw SQL queries.</w:t>
+        <w:t xml:space="preserve">To implement all CRUD operations (Create, Read, Update, Delete) using the SQLAlchemy ORM.</w:t>
       </w:r>
     </w:p>
     <w:p>
@@ -1924,7 +1935,7 @@
         <w:pStyle w:val="Compact"/>
       </w:pPr>
       <w:r>
-        <w:t xml:space="preserve">All four CRUD operations implemented with raw SQL across the system.</w:t>
+        <w:t xml:space="preserve">All four CRUD operations implemented through the SQLAlchemy ORM across the system.</w:t>
       </w:r>
     </w:p>
     <w:p>
@@ -2244,13 +2255,13 @@
           <w:bCs/>
           <w:b/>
         </w:rPr>
-        <w:t xml:space="preserve">PyMySQL</w:t>
-      </w:r>
-      <w:r>
-        <w:t xml:space="preserve"> </w:t>
-      </w:r>
-      <w:r>
-        <w:t xml:space="preserve">— the library that connects Python to MySQL; all queries are written as raw SQL to demonstrate direct database operations.</w:t>
+        <w:t xml:space="preserve">SQLAlchemy ORM (Flask-SQLAlchemy)</w:t>
+      </w:r>
+      <w:r>
+        <w:t xml:space="preserve"> </w:t>
+      </w:r>
+      <w:r>
+        <w:t xml:space="preserve">— maps every database table to a Python model class, so rows are handled as objects; taught in class and used for all CRUD operations.</w:t>
       </w:r>
     </w:p>
     <w:p>
@@ -2266,13 +2277,13 @@
           <w:bCs/>
           <w:b/>
         </w:rPr>
-        <w:t xml:space="preserve">HTML + Jinja Templates</w:t>
-      </w:r>
-      <w:r>
-        <w:t xml:space="preserve"> </w:t>
-      </w:r>
-      <w:r>
-        <w:t xml:space="preserve">— page structure, with one shared base layout.</w:t>
+        <w:t xml:space="preserve">PyMySQL</w:t>
+      </w:r>
+      <w:r>
+        <w:t xml:space="preserve"> </w:t>
+      </w:r>
+      <w:r>
+        <w:t xml:space="preserve">— the driver through which SQLAlchemy connects to MySQL.</w:t>
       </w:r>
     </w:p>
     <w:p>
@@ -2288,13 +2299,13 @@
           <w:bCs/>
           <w:b/>
         </w:rPr>
-        <w:t xml:space="preserve">CSS</w:t>
-      </w:r>
-      <w:r>
-        <w:t xml:space="preserve"> </w:t>
-      </w:r>
-      <w:r>
-        <w:t xml:space="preserve">— plain custom stylesheet (no framework), with colors defined once as variables.</w:t>
+        <w:t xml:space="preserve">HTML + Jinja Templates</w:t>
+      </w:r>
+      <w:r>
+        <w:t xml:space="preserve"> </w:t>
+      </w:r>
+      <w:r>
+        <w:t xml:space="preserve">— page structure, with one shared base layout.</w:t>
       </w:r>
     </w:p>
     <w:p>
@@ -2310,6 +2321,28 @@
           <w:bCs/>
           <w:b/>
         </w:rPr>
+        <w:t xml:space="preserve">CSS</w:t>
+      </w:r>
+      <w:r>
+        <w:t xml:space="preserve"> </w:t>
+      </w:r>
+      <w:r>
+        <w:t xml:space="preserve">— plain custom stylesheet (no framework), with colors defined once as variables.</w:t>
+      </w:r>
+    </w:p>
+    <w:p>
+      <w:pPr>
+        <w:numPr>
+          <w:ilvl w:val="0"/>
+          <w:numId w:val="1006"/>
+        </w:numPr>
+        <w:pStyle w:val="Compact"/>
+      </w:pPr>
+      <w:r>
+        <w:rPr>
+          <w:bCs/>
+          <w:b/>
+        </w:rPr>
         <w:t xml:space="preserve">Git / GitHub</w:t>
       </w:r>
       <w:r>
@@ -2827,16 +2860,7 @@
         <w:t xml:space="preserve"> </w:t>
       </w:r>
       <w:r>
-        <w:t xml:space="preserve">All SQL queries shall use parameterized placeholders (</w:t>
-      </w:r>
-      <w:r>
-        <w:rPr>
-          <w:rStyle w:val="VerbatimChar"/>
-        </w:rPr>
-        <w:t xml:space="preserve">%s</w:t>
-      </w:r>
-      <w:r>
-        <w:t xml:space="preserve">) to prevent SQL injection.</w:t>
+        <w:t xml:space="preserve">All database access goes through the SQLAlchemy ORM, which sends every value as a bound parameter, preventing SQL injection.</w:t>
       </w:r>
     </w:p>
     <w:p>
@@ -4036,7 +4060,7 @@
         <w:rPr>
           <w:rStyle w:val="VerbatimChar"/>
         </w:rPr>
-        <w:t xml:space="preserve">├── db.py               database connection + shared helper functions</w:t>
+        <w:t xml:space="preserve">x-noop</w:t>
       </w:r>
       <w:r>
         <w:br/>
@@ -6626,7 +6650,13 @@
         <w:pStyle w:val="FirstParagraph"/>
       </w:pPr>
       <w:r>
-        <w:t xml:space="preserve">The application is implemented in Python Flask with raw SQL through PyMySQL.</w:t>
+        <w:t xml:space="preserve">The application is implemented in Python Flask with the SQLAlchemy ORM over</w:t>
+      </w:r>
+      <w:r>
+        <w:t xml:space="preserve"> </w:t>
+      </w:r>
+      <w:r>
+        <w:t xml:space="preserve">MySQL.</w:t>
       </w:r>
       <w:r>
         <w:t xml:space="preserve"> </w:t>
@@ -6635,19 +6665,40 @@
         <w:rPr>
           <w:rStyle w:val="VerbatimChar"/>
         </w:rPr>
+        <w:t xml:space="preserve">models.py</w:t>
+      </w:r>
+      <w:r>
+        <w:t xml:space="preserve"> </w:t>
+      </w:r>
+      <w:r>
+        <w:t xml:space="preserve">defines every table as a model class with its</w:t>
+      </w:r>
+      <w:r>
+        <w:t xml:space="preserve"> </w:t>
+      </w:r>
+      <w:r>
+        <w:t xml:space="preserve">relationships.</w:t>
+      </w:r>
+      <w:r>
+        <w:t xml:space="preserve"> </w:t>
+      </w:r>
+      <w:r>
+        <w:rPr>
+          <w:rStyle w:val="VerbatimChar"/>
+        </w:rPr>
         <w:t xml:space="preserve">app.py</w:t>
       </w:r>
       <w:r>
         <w:t xml:space="preserve"> </w:t>
       </w:r>
       <w:r>
-        <w:t xml:space="preserve">acts as a routing table: every URL of the site is connected to a</w:t>
-      </w:r>
-      <w:r>
-        <w:t xml:space="preserve"> </w:t>
-      </w:r>
-      <w:r>
-        <w:t xml:space="preserve">function in the</w:t>
+        <w:t xml:space="preserve">acts as a routing table: every URL of the site is</w:t>
+      </w:r>
+      <w:r>
+        <w:t xml:space="preserve"> </w:t>
+      </w:r>
+      <w:r>
+        <w:t xml:space="preserve">connected to a function in the</w:t>
       </w:r>
       <w:r>
         <w:t xml:space="preserve"> </w:t>
@@ -6674,28 +6725,22 @@
         <w:t xml:space="preserve">app.add_url_rule()</w:t>
       </w:r>
       <w:r>
-        <w:t xml:space="preserve">. Each function</w:t>
-      </w:r>
-      <w:r>
-        <w:t xml:space="preserve"> </w:t>
-      </w:r>
-      <w:r>
-        <w:t xml:space="preserve">opens a database connection with</w:t>
-      </w:r>
-      <w:r>
-        <w:t xml:space="preserve"> </w:t>
+        <w:t xml:space="preserve">.</w:t>
+      </w:r>
+      <w:r>
+        <w:t xml:space="preserve"> </w:t>
+      </w:r>
+      <w:r>
+        <w:t xml:space="preserve">Each function queries or changes data through the ORM (</w:t>
       </w:r>
       <w:r>
         <w:rPr>
           <w:rStyle w:val="VerbatimChar"/>
         </w:rPr>
-        <w:t xml:space="preserve">get_db()</w:t>
-      </w:r>
-      <w:r>
-        <w:t xml:space="preserve"> </w:t>
-      </w:r>
-      <w:r>
-        <w:t xml:space="preserve">(defined in</w:t>
+        <w:t xml:space="preserve">Model.query</w:t>
+      </w:r>
+      <w:r>
+        <w:t xml:space="preserve">,</w:t>
       </w:r>
       <w:r>
         <w:t xml:space="preserve"> </w:t>
@@ -6704,16 +6749,10 @@
         <w:rPr>
           <w:rStyle w:val="VerbatimChar"/>
         </w:rPr>
-        <w:t xml:space="preserve">db.py</w:t>
-      </w:r>
-      <w:r>
-        <w:t xml:space="preserve">), executes</w:t>
-      </w:r>
-      <w:r>
-        <w:t xml:space="preserve"> </w:t>
-      </w:r>
-      <w:r>
-        <w:t xml:space="preserve">its SQL with</w:t>
+        <w:t xml:space="preserve">db.session.add/delete</w:t>
+      </w:r>
+      <w:r>
+        <w:t xml:space="preserve">,</w:t>
       </w:r>
       <w:r>
         <w:t xml:space="preserve"> </w:t>
@@ -6722,16 +6761,16 @@
         <w:rPr>
           <w:rStyle w:val="VerbatimChar"/>
         </w:rPr>
-        <w:t xml:space="preserve">cursor.execute()</w:t>
-      </w:r>
-      <w:r>
-        <w:t xml:space="preserve">, commits if data was changed, closes the</w:t>
-      </w:r>
-      <w:r>
-        <w:t xml:space="preserve"> </w:t>
-      </w:r>
-      <w:r>
-        <w:t xml:space="preserve">connection, and renders an HTML template.</w:t>
+        <w:t xml:space="preserve">db.session.commit()</w:t>
+      </w:r>
+      <w:r>
+        <w:t xml:space="preserve">) and renders an HTML</w:t>
+      </w:r>
+      <w:r>
+        <w:t xml:space="preserve"> </w:t>
+      </w:r>
+      <w:r>
+        <w:t xml:space="preserve">template.</w:t>
       </w:r>
     </w:p>
     <w:p>
@@ -6778,16 +6817,22 @@
         <w:pStyle w:val="FirstParagraph"/>
       </w:pPr>
       <w:r>
-        <w:t xml:space="preserve">Database connection (</w:t>
+        <w:t xml:space="preserve">A model class in</w:t>
+      </w:r>
+      <w:r>
+        <w:t xml:space="preserve"> </w:t>
       </w:r>
       <w:r>
         <w:rPr>
           <w:rStyle w:val="VerbatimChar"/>
         </w:rPr>
-        <w:t xml:space="preserve">db.py</w:t>
-      </w:r>
-      <w:r>
-        <w:t xml:space="preserve">):</w:t>
+        <w:t xml:space="preserve">models.py</w:t>
+      </w:r>
+      <w:r>
+        <w:t xml:space="preserve"> </w:t>
+      </w:r>
+      <w:r>
+        <w:t xml:space="preserve">maps a table to Python (example):</w:t>
       </w:r>
     </w:p>
     <w:p>
@@ -6798,13 +6843,13 @@
         <w:rPr>
           <w:rStyle w:val="KeywordTok"/>
         </w:rPr>
-        <w:t xml:space="preserve">def</w:t>
+        <w:t xml:space="preserve">class</w:t>
       </w:r>
       <w:r>
         <w:rPr>
           <w:rStyle w:val="NormalTok"/>
         </w:rPr>
-        <w:t xml:space="preserve"> get_db():</w:t>
+        <w:t xml:space="preserve"> Student(db.Model):</w:t>
       </w:r>
       <w:r>
         <w:br/>
@@ -6813,31 +6858,76 @@
         <w:rPr>
           <w:rStyle w:val="NormalTok"/>
         </w:rPr>
+        <w:t xml:space="preserve">    __tablename__ </w:t>
+      </w:r>
+      <w:r>
+        <w:rPr>
+          <w:rStyle w:val="OperatorTok"/>
+        </w:rPr>
+        <w:t xml:space="preserve">=</w:t>
+      </w:r>
+      <w:r>
+        <w:rPr>
+          <w:rStyle w:val="NormalTok"/>
+        </w:rPr>
+        <w:t xml:space="preserve"> </w:t>
+      </w:r>
+      <w:r>
+        <w:rPr>
+          <w:rStyle w:val="StringTok"/>
+        </w:rPr>
+        <w:t xml:space="preserve">'students'</w:t>
+      </w:r>
+      <w:r>
+        <w:br/>
+      </w:r>
+      <w:r>
+        <w:rPr>
+          <w:rStyle w:val="NormalTok"/>
+        </w:rPr>
         <w:t xml:space="preserve">    </w:t>
       </w:r>
       <w:r>
         <w:rPr>
-          <w:rStyle w:val="ControlFlowTok"/>
-        </w:rPr>
-        <w:t xml:space="preserve">return</w:t>
+          <w:rStyle w:val="BuiltInTok"/>
+        </w:rPr>
+        <w:t xml:space="preserve">id</w:t>
       </w:r>
       <w:r>
         <w:rPr>
           <w:rStyle w:val="NormalTok"/>
         </w:rPr>
-        <w:t xml:space="preserve"> pymysql.</w:t>
-      </w:r>
-      <w:r>
-        <w:rPr>
-          <w:rStyle w:val="ExtensionTok"/>
-        </w:rPr>
-        <w:t xml:space="preserve">connect</w:t>
+        <w:t xml:space="preserve"> </w:t>
+      </w:r>
+      <w:r>
+        <w:rPr>
+          <w:rStyle w:val="OperatorTok"/>
+        </w:rPr>
+        <w:t xml:space="preserve">=</w:t>
       </w:r>
       <w:r>
         <w:rPr>
           <w:rStyle w:val="NormalTok"/>
         </w:rPr>
-        <w:t xml:space="preserve">(</w:t>
+        <w:t xml:space="preserve"> db.Column(db.Integer, primary_key</w:t>
+      </w:r>
+      <w:r>
+        <w:rPr>
+          <w:rStyle w:val="OperatorTok"/>
+        </w:rPr>
+        <w:t xml:space="preserve">=</w:t>
+      </w:r>
+      <w:r>
+        <w:rPr>
+          <w:rStyle w:val="VariableTok"/>
+        </w:rPr>
+        <w:t xml:space="preserve">True</w:t>
+      </w:r>
+      <w:r>
+        <w:rPr>
+          <w:rStyle w:val="NormalTok"/>
+        </w:rPr>
+        <w:t xml:space="preserve">)</w:t>
       </w:r>
       <w:r>
         <w:br/>
@@ -6846,7 +6936,7 @@
         <w:rPr>
           <w:rStyle w:val="NormalTok"/>
         </w:rPr>
-        <w:t xml:space="preserve">        host</w:t>
+        <w:t xml:space="preserve">    user_id </w:t>
       </w:r>
       <w:r>
         <w:rPr>
@@ -6856,15 +6946,21 @@
       </w:r>
       <w:r>
         <w:rPr>
+          <w:rStyle w:val="NormalTok"/>
+        </w:rPr>
+        <w:t xml:space="preserve"> db.Column(db.Integer, db.ForeignKey(</w:t>
+      </w:r>
+      <w:r>
+        <w:rPr>
           <w:rStyle w:val="StringTok"/>
         </w:rPr>
-        <w:t xml:space="preserve">'localhost'</w:t>
+        <w:t xml:space="preserve">'users.id'</w:t>
       </w:r>
       <w:r>
         <w:rPr>
           <w:rStyle w:val="NormalTok"/>
         </w:rPr>
-        <w:t xml:space="preserve">, user</w:t>
+        <w:t xml:space="preserve">), unique</w:t>
       </w:r>
       <w:r>
         <w:rPr>
@@ -6874,15 +6970,102 @@
       </w:r>
       <w:r>
         <w:rPr>
+          <w:rStyle w:val="VariableTok"/>
+        </w:rPr>
+        <w:t xml:space="preserve">True</w:t>
+      </w:r>
+      <w:r>
+        <w:rPr>
+          <w:rStyle w:val="NormalTok"/>
+        </w:rPr>
+        <w:t xml:space="preserve">)</w:t>
+      </w:r>
+      <w:r>
+        <w:br/>
+      </w:r>
+      <w:r>
+        <w:rPr>
+          <w:rStyle w:val="NormalTok"/>
+        </w:rPr>
+        <w:t xml:space="preserve">    roll_number </w:t>
+      </w:r>
+      <w:r>
+        <w:rPr>
+          <w:rStyle w:val="OperatorTok"/>
+        </w:rPr>
+        <w:t xml:space="preserve">=</w:t>
+      </w:r>
+      <w:r>
+        <w:rPr>
+          <w:rStyle w:val="NormalTok"/>
+        </w:rPr>
+        <w:t xml:space="preserve"> db.Column(db.String(</w:t>
+      </w:r>
+      <w:r>
+        <w:rPr>
+          <w:rStyle w:val="DecValTok"/>
+        </w:rPr>
+        <w:t xml:space="preserve">50</w:t>
+      </w:r>
+      <w:r>
+        <w:rPr>
+          <w:rStyle w:val="NormalTok"/>
+        </w:rPr>
+        <w:t xml:space="preserve">))</w:t>
+      </w:r>
+      <w:r>
+        <w:br/>
+      </w:r>
+      <w:r>
+        <w:rPr>
+          <w:rStyle w:val="NormalTok"/>
+        </w:rPr>
+        <w:t xml:space="preserve">    semester </w:t>
+      </w:r>
+      <w:r>
+        <w:rPr>
+          <w:rStyle w:val="OperatorTok"/>
+        </w:rPr>
+        <w:t xml:space="preserve">=</w:t>
+      </w:r>
+      <w:r>
+        <w:rPr>
+          <w:rStyle w:val="NormalTok"/>
+        </w:rPr>
+        <w:t xml:space="preserve"> db.Column(db.Integer)</w:t>
+      </w:r>
+      <w:r>
+        <w:br/>
+      </w:r>
+      <w:r>
+        <w:rPr>
+          <w:rStyle w:val="NormalTok"/>
+        </w:rPr>
+        <w:t xml:space="preserve">    applications </w:t>
+      </w:r>
+      <w:r>
+        <w:rPr>
+          <w:rStyle w:val="OperatorTok"/>
+        </w:rPr>
+        <w:t xml:space="preserve">=</w:t>
+      </w:r>
+      <w:r>
+        <w:rPr>
+          <w:rStyle w:val="NormalTok"/>
+        </w:rPr>
+        <w:t xml:space="preserve"> db.relationship(</w:t>
+      </w:r>
+      <w:r>
+        <w:rPr>
           <w:rStyle w:val="StringTok"/>
         </w:rPr>
-        <w:t xml:space="preserve">'root'</w:t>
+        <w:t xml:space="preserve">'Application'</w:t>
       </w:r>
       <w:r>
         <w:rPr>
           <w:rStyle w:val="NormalTok"/>
         </w:rPr>
-        <w:t xml:space="preserve">, password</w:t>
+        <w:t xml:space="preserve">, backref</w:t>
       </w:r>
       <w:r>
         <w:rPr>
@@ -6894,7 +7077,7 @@
         <w:rPr>
           <w:rStyle w:val="StringTok"/>
         </w:rPr>
-        <w:t xml:space="preserve">'......'</w:t>
+        <w:t xml:space="preserve">'student'</w:t>
       </w:r>
       <w:r>
         <w:rPr>
@@ -6909,7 +7092,7 @@
         <w:rPr>
           <w:rStyle w:val="NormalTok"/>
         </w:rPr>
-        <w:t xml:space="preserve">        database</w:t>
+        <w:t xml:space="preserve">                                   cascade</w:t>
       </w:r>
       <w:r>
         <w:rPr>
@@ -6921,617 +7104,411 @@
         <w:rPr>
           <w:rStyle w:val="StringTok"/>
         </w:rPr>
-        <w:t xml:space="preserve">'internship_db'</w:t>
+        <w:t xml:space="preserve">'all, delete-orphan'</w:t>
       </w:r>
       <w:r>
         <w:rPr>
           <w:rStyle w:val="NormalTok"/>
         </w:rPr>
+        <w:t xml:space="preserve">)</w:t>
+      </w:r>
+    </w:p>
+    <w:p>
+      <w:pPr>
+        <w:pStyle w:val="FirstParagraph"/>
+      </w:pPr>
+      <w:r>
+        <w:t xml:space="preserve">CREATE — registration builds the user and profile objects together through</w:t>
+      </w:r>
+      <w:r>
+        <w:t xml:space="preserve"> </w:t>
+      </w:r>
+      <w:r>
+        <w:t xml:space="preserve">the relationship, and one commit inserts both rows:</w:t>
+      </w:r>
+    </w:p>
+    <w:p>
+      <w:pPr>
+        <w:pStyle w:val="SourceCode"/>
+      </w:pPr>
+      <w:r>
+        <w:rPr>
+          <w:rStyle w:val="NormalTok"/>
+        </w:rPr>
+        <w:t xml:space="preserve">user </w:t>
+      </w:r>
+      <w:r>
+        <w:rPr>
+          <w:rStyle w:val="OperatorTok"/>
+        </w:rPr>
+        <w:t xml:space="preserve">=</w:t>
+      </w:r>
+      <w:r>
+        <w:rPr>
+          <w:rStyle w:val="NormalTok"/>
+        </w:rPr>
+        <w:t xml:space="preserve"> User(role_id</w:t>
+      </w:r>
+      <w:r>
+        <w:rPr>
+          <w:rStyle w:val="OperatorTok"/>
+        </w:rPr>
+        <w:t xml:space="preserve">=</w:t>
+      </w:r>
+      <w:r>
+        <w:rPr>
+          <w:rStyle w:val="NormalTok"/>
+        </w:rPr>
+        <w:t xml:space="preserve">role.</w:t>
+      </w:r>
+      <w:r>
+        <w:rPr>
+          <w:rStyle w:val="BuiltInTok"/>
+        </w:rPr>
+        <w:t xml:space="preserve">id</w:t>
+      </w:r>
+      <w:r>
+        <w:rPr>
+          <w:rStyle w:val="NormalTok"/>
+        </w:rPr>
+        <w:t xml:space="preserve">, name</w:t>
+      </w:r>
+      <w:r>
+        <w:rPr>
+          <w:rStyle w:val="OperatorTok"/>
+        </w:rPr>
+        <w:t xml:space="preserve">=</w:t>
+      </w:r>
+      <w:r>
+        <w:rPr>
+          <w:rStyle w:val="NormalTok"/>
+        </w:rPr>
+        <w:t xml:space="preserve">name, email</w:t>
+      </w:r>
+      <w:r>
+        <w:rPr>
+          <w:rStyle w:val="OperatorTok"/>
+        </w:rPr>
+        <w:t xml:space="preserve">=</w:t>
+      </w:r>
+      <w:r>
+        <w:rPr>
+          <w:rStyle w:val="NormalTok"/>
+        </w:rPr>
+        <w:t xml:space="preserve">email)</w:t>
+      </w:r>
+      <w:r>
+        <w:br/>
+      </w:r>
+      <w:r>
+        <w:rPr>
+          <w:rStyle w:val="NormalTok"/>
+        </w:rPr>
+        <w:t xml:space="preserve">user.set_password(password)</w:t>
+      </w:r>
+      <w:r>
+        <w:br/>
+      </w:r>
+      <w:r>
+        <w:rPr>
+          <w:rStyle w:val="NormalTok"/>
+        </w:rPr>
+        <w:t xml:space="preserve">student </w:t>
+      </w:r>
+      <w:r>
+        <w:rPr>
+          <w:rStyle w:val="OperatorTok"/>
+        </w:rPr>
+        <w:t xml:space="preserve">=</w:t>
+      </w:r>
+      <w:r>
+        <w:rPr>
+          <w:rStyle w:val="NormalTok"/>
+        </w:rPr>
+        <w:t xml:space="preserve"> Student(user</w:t>
+      </w:r>
+      <w:r>
+        <w:rPr>
+          <w:rStyle w:val="OperatorTok"/>
+        </w:rPr>
+        <w:t xml:space="preserve">=</w:t>
+      </w:r>
+      <w:r>
+        <w:rPr>
+          <w:rStyle w:val="NormalTok"/>
+        </w:rPr>
+        <w:t xml:space="preserve">user, roll_number</w:t>
+      </w:r>
+      <w:r>
+        <w:rPr>
+          <w:rStyle w:val="OperatorTok"/>
+        </w:rPr>
+        <w:t xml:space="preserve">=</w:t>
+      </w:r>
+      <w:r>
+        <w:rPr>
+          <w:rStyle w:val="NormalTok"/>
+        </w:rPr>
+        <w:t xml:space="preserve">roll_number, semester</w:t>
+      </w:r>
+      <w:r>
+        <w:rPr>
+          <w:rStyle w:val="OperatorTok"/>
+        </w:rPr>
+        <w:t xml:space="preserve">=</w:t>
+      </w:r>
+      <w:r>
+        <w:rPr>
+          <w:rStyle w:val="NormalTok"/>
+        </w:rPr>
+        <w:t xml:space="preserve">semester)</w:t>
+      </w:r>
+      <w:r>
+        <w:br/>
+      </w:r>
+      <w:r>
+        <w:rPr>
+          <w:rStyle w:val="NormalTok"/>
+        </w:rPr>
+        <w:t xml:space="preserve">db.session.add(student)</w:t>
+      </w:r>
+      <w:r>
+        <w:br/>
+      </w:r>
+      <w:r>
+        <w:rPr>
+          <w:rStyle w:val="NormalTok"/>
+        </w:rPr>
+        <w:t xml:space="preserve">db.session.commit()</w:t>
+      </w:r>
+    </w:p>
+    <w:p>
+      <w:pPr>
+        <w:pStyle w:val="FirstParagraph"/>
+      </w:pPr>
+      <w:r>
+        <w:t xml:space="preserve">READ — queries return objects, and related data is reached through</w:t>
+      </w:r>
+      <w:r>
+        <w:t xml:space="preserve"> </w:t>
+      </w:r>
+      <w:r>
+        <w:t xml:space="preserve">relationships instead of manual joins:</w:t>
+      </w:r>
+    </w:p>
+    <w:p>
+      <w:pPr>
+        <w:pStyle w:val="SourceCode"/>
+      </w:pPr>
+      <w:r>
+        <w:rPr>
+          <w:rStyle w:val="NormalTok"/>
+        </w:rPr>
+        <w:t xml:space="preserve">apps </w:t>
+      </w:r>
+      <w:r>
+        <w:rPr>
+          <w:rStyle w:val="OperatorTok"/>
+        </w:rPr>
+        <w:t xml:space="preserve">=</w:t>
+      </w:r>
+      <w:r>
+        <w:rPr>
+          <w:rStyle w:val="NormalTok"/>
+        </w:rPr>
+        <w:t xml:space="preserve"> Application.query.filter_by(student_id</w:t>
+      </w:r>
+      <w:r>
+        <w:rPr>
+          <w:rStyle w:val="OperatorTok"/>
+        </w:rPr>
+        <w:t xml:space="preserve">=</w:t>
+      </w:r>
+      <w:r>
+        <w:rPr>
+          <w:rStyle w:val="NormalTok"/>
+        </w:rPr>
+        <w:t xml:space="preserve">me.</w:t>
+      </w:r>
+      <w:r>
+        <w:rPr>
+          <w:rStyle w:val="BuiltInTok"/>
+        </w:rPr>
+        <w:t xml:space="preserve">id</w:t>
+      </w:r>
+      <w:r>
+        <w:rPr>
+          <w:rStyle w:val="NormalTok"/>
+        </w:rPr>
+        <w:t xml:space="preserve">).</w:t>
+      </w:r>
+      <w:r>
+        <w:rPr>
+          <w:rStyle w:val="BuiltInTok"/>
+        </w:rPr>
+        <w:t xml:space="preserve">all</w:t>
+      </w:r>
+      <w:r>
+        <w:rPr>
+          <w:rStyle w:val="NormalTok"/>
+        </w:rPr>
+        <w:t xml:space="preserve">()</w:t>
+      </w:r>
+      <w:r>
+        <w:br/>
+      </w:r>
+      <w:r>
+        <w:rPr>
+          <w:rStyle w:val="CommentTok"/>
+        </w:rPr>
+        <w:t xml:space="preserve"># in the template: a.internship.title, a.internship.company.user.name</w:t>
+      </w:r>
+    </w:p>
+    <w:p>
+      <w:pPr>
+        <w:pStyle w:val="FirstParagraph"/>
+      </w:pPr>
+      <w:r>
+        <w:t xml:space="preserve">UPDATE and DELETE — change an attribute or delete an object, then commit:</w:t>
+      </w:r>
+    </w:p>
+    <w:p>
+      <w:pPr>
+        <w:pStyle w:val="SourceCode"/>
+      </w:pPr>
+      <w:r>
+        <w:rPr>
+          <w:rStyle w:val="NormalTok"/>
+        </w:rPr>
+        <w:t xml:space="preserve">application.status </w:t>
+      </w:r>
+      <w:r>
+        <w:rPr>
+          <w:rStyle w:val="OperatorTok"/>
+        </w:rPr>
+        <w:t xml:space="preserve">=</w:t>
+      </w:r>
+      <w:r>
+        <w:rPr>
+          <w:rStyle w:val="NormalTok"/>
+        </w:rPr>
+        <w:t xml:space="preserve"> </w:t>
+      </w:r>
+      <w:r>
+        <w:rPr>
+          <w:rStyle w:val="StringTok"/>
+        </w:rPr>
+        <w:t xml:space="preserve">'selected'</w:t>
+      </w:r>
+      <w:r>
+        <w:br/>
+      </w:r>
+      <w:r>
+        <w:rPr>
+          <w:rStyle w:val="NormalTok"/>
+        </w:rPr>
+        <w:t xml:space="preserve">db.session.commit()</w:t>
+      </w:r>
+      <w:r>
+        <w:br/>
+      </w:r>
+      <w:r>
+        <w:br/>
+      </w:r>
+      <w:r>
+        <w:rPr>
+          <w:rStyle w:val="NormalTok"/>
+        </w:rPr>
+        <w:t xml:space="preserve">db.session.delete(internship)   </w:t>
+      </w:r>
+      <w:r>
+        <w:rPr>
+          <w:rStyle w:val="CommentTok"/>
+        </w:rPr>
+        <w:t xml:space="preserve"># its applications and logs cascade</w:t>
+      </w:r>
+      <w:r>
+        <w:br/>
+      </w:r>
+      <w:r>
+        <w:rPr>
+          <w:rStyle w:val="NormalTok"/>
+        </w:rPr>
+        <w:t xml:space="preserve">db.session.commit()</w:t>
+      </w:r>
+    </w:p>
+    <w:p>
+      <w:pPr>
+        <w:pStyle w:val="FirstParagraph"/>
+      </w:pPr>
+      <w:r>
+        <w:t xml:space="preserve">Code efficiency measures: the ORM binds every value as a parameter</w:t>
+      </w:r>
+      <w:r>
+        <w:t xml:space="preserve"> </w:t>
+      </w:r>
+      <w:r>
+        <w:t xml:space="preserve">(preventing SQL injection); relationships with</w:t>
+      </w:r>
+      <w:r>
+        <w:t xml:space="preserve"> </w:t>
+      </w:r>
+      <w:r>
+        <w:rPr>
+          <w:rStyle w:val="VerbatimChar"/>
+        </w:rPr>
+        <w:t xml:space="preserve">cascade</w:t>
+      </w:r>
+      <w:r>
+        <w:t xml:space="preserve"> </w:t>
+      </w:r>
+      <w:r>
+        <w:t xml:space="preserve">remove related</w:t>
+      </w:r>
+      <w:r>
+        <w:t xml:space="preserve"> </w:t>
+      </w:r>
+      <w:r>
+        <w:t xml:space="preserve">rows automatically; shared helpers (</w:t>
+      </w:r>
+      <w:r>
+        <w:rPr>
+          <w:rStyle w:val="VerbatimChar"/>
+        </w:rPr>
+        <w:t xml:space="preserve">current_student()</w:t>
+      </w:r>
+      <w:r>
         <w:t xml:space="preserve">,</w:t>
       </w:r>
       <w:r>
-        <w:br/>
-      </w:r>
-      <w:r>
-        <w:rPr>
-          <w:rStyle w:val="NormalTok"/>
-        </w:rPr>
-        <w:t xml:space="preserve">        cursorclass</w:t>
-      </w:r>
-      <w:r>
-        <w:rPr>
-          <w:rStyle w:val="OperatorTok"/>
-        </w:rPr>
-        <w:t xml:space="preserve">=</w:t>
-      </w:r>
-      <w:r>
-        <w:rPr>
-          <w:rStyle w:val="NormalTok"/>
-        </w:rPr>
-        <w:t xml:space="preserve">pymysql.cursors.DictCursor)</w:t>
-      </w:r>
-    </w:p>
-    <w:p>
-      <w:pPr>
-        <w:pStyle w:val="FirstParagraph"/>
-      </w:pPr>
-      <w:r>
-        <w:t xml:space="preserve">Registration inserts into two tables using the new user’s id</w:t>
-      </w:r>
-      <w:r>
-        <w:t xml:space="preserve"> </w:t>
-      </w:r>
-      <w:r>
-        <w:t xml:space="preserve">(</w:t>
+        <w:t xml:space="preserve"> </w:t>
       </w:r>
       <w:r>
         <w:rPr>
           <w:rStyle w:val="VerbatimChar"/>
         </w:rPr>
-        <w:t xml:space="preserve">cursor.lastrowid</w:t>
-      </w:r>
-      <w:r>
-        <w:t xml:space="preserve">) as the foreign key:</w:t>
-      </w:r>
-    </w:p>
-    <w:p>
-      <w:pPr>
-        <w:pStyle w:val="SourceCode"/>
-      </w:pPr>
-      <w:r>
-        <w:rPr>
-          <w:rStyle w:val="NormalTok"/>
-        </w:rPr>
-        <w:t xml:space="preserve">cur.execute(</w:t>
-      </w:r>
-      <w:r>
-        <w:br/>
-      </w:r>
-      <w:r>
-        <w:rPr>
-          <w:rStyle w:val="NormalTok"/>
-        </w:rPr>
-        <w:t xml:space="preserve">    </w:t>
-      </w:r>
-      <w:r>
-        <w:rPr>
-          <w:rStyle w:val="StringTok"/>
-        </w:rPr>
-        <w:t xml:space="preserve">"INSERT INTO users (role_id, name, email, password) VALUES (</w:t>
-      </w:r>
-      <w:r>
-        <w:rPr>
-          <w:rStyle w:val="SpecialCharTok"/>
-        </w:rPr>
-        <w:t xml:space="preserve">%s</w:t>
-      </w:r>
-      <w:r>
-        <w:rPr>
-          <w:rStyle w:val="StringTok"/>
-        </w:rPr>
-        <w:t xml:space="preserve">, </w:t>
-      </w:r>
-      <w:r>
-        <w:rPr>
-          <w:rStyle w:val="SpecialCharTok"/>
-        </w:rPr>
-        <w:t xml:space="preserve">%s</w:t>
-      </w:r>
-      <w:r>
-        <w:rPr>
-          <w:rStyle w:val="StringTok"/>
-        </w:rPr>
-        <w:t xml:space="preserve">, </w:t>
-      </w:r>
-      <w:r>
-        <w:rPr>
-          <w:rStyle w:val="SpecialCharTok"/>
-        </w:rPr>
-        <w:t xml:space="preserve">%s</w:t>
-      </w:r>
-      <w:r>
-        <w:rPr>
-          <w:rStyle w:val="StringTok"/>
-        </w:rPr>
-        <w:t xml:space="preserve">, </w:t>
-      </w:r>
-      <w:r>
-        <w:rPr>
-          <w:rStyle w:val="SpecialCharTok"/>
-        </w:rPr>
-        <w:t xml:space="preserve">%s</w:t>
-      </w:r>
-      <w:r>
-        <w:rPr>
-          <w:rStyle w:val="StringTok"/>
-        </w:rPr>
-        <w:t xml:space="preserve">)"</w:t>
-      </w:r>
-      <w:r>
-        <w:rPr>
-          <w:rStyle w:val="NormalTok"/>
-        </w:rPr>
+        <w:t xml:space="preserve">current_company()</w:t>
+      </w:r>
+      <w:r>
         <w:t xml:space="preserve">,</w:t>
       </w:r>
       <w:r>
-        <w:br/>
-      </w:r>
-      <w:r>
-        <w:rPr>
-          <w:rStyle w:val="NormalTok"/>
-        </w:rPr>
-        <w:t xml:space="preserve">    (role_id_of(cur, </w:t>
-      </w:r>
-      <w:r>
-        <w:rPr>
-          <w:rStyle w:val="StringTok"/>
-        </w:rPr>
-        <w:t xml:space="preserve">'student'</w:t>
-      </w:r>
-      <w:r>
-        <w:rPr>
-          <w:rStyle w:val="NormalTok"/>
-        </w:rPr>
-        <w:t xml:space="preserve">), name, email, generate_password_hash(password)))</w:t>
-      </w:r>
-      <w:r>
-        <w:br/>
-      </w:r>
-      <w:r>
-        <w:rPr>
-          <w:rStyle w:val="NormalTok"/>
-        </w:rPr>
-        <w:t xml:space="preserve">new_user_id </w:t>
-      </w:r>
-      <w:r>
-        <w:rPr>
-          <w:rStyle w:val="OperatorTok"/>
-        </w:rPr>
-        <w:t xml:space="preserve">=</w:t>
-      </w:r>
-      <w:r>
-        <w:rPr>
-          <w:rStyle w:val="NormalTok"/>
-        </w:rPr>
-        <w:t xml:space="preserve"> cur.lastrowid</w:t>
-      </w:r>
-      <w:r>
-        <w:br/>
-      </w:r>
-      <w:r>
-        <w:rPr>
-          <w:rStyle w:val="NormalTok"/>
-        </w:rPr>
-        <w:t xml:space="preserve">cur.execute(</w:t>
-      </w:r>
-      <w:r>
-        <w:br/>
-      </w:r>
-      <w:r>
-        <w:rPr>
-          <w:rStyle w:val="NormalTok"/>
-        </w:rPr>
-        <w:t xml:space="preserve">    </w:t>
-      </w:r>
-      <w:r>
-        <w:rPr>
-          <w:rStyle w:val="StringTok"/>
-        </w:rPr>
-        <w:t xml:space="preserve">"INSERT INTO students (user_id, roll_number, department, semester, skills) "</w:t>
-      </w:r>
-      <w:r>
-        <w:br/>
-      </w:r>
-      <w:r>
-        <w:rPr>
-          <w:rStyle w:val="NormalTok"/>
-        </w:rPr>
-        <w:t xml:space="preserve">    </w:t>
-      </w:r>
-      <w:r>
-        <w:rPr>
-          <w:rStyle w:val="StringTok"/>
-        </w:rPr>
-        <w:t xml:space="preserve">"VALUES (</w:t>
-      </w:r>
-      <w:r>
-        <w:rPr>
-          <w:rStyle w:val="SpecialCharTok"/>
-        </w:rPr>
-        <w:t xml:space="preserve">%s</w:t>
-      </w:r>
-      <w:r>
-        <w:rPr>
-          <w:rStyle w:val="StringTok"/>
-        </w:rPr>
-        <w:t xml:space="preserve">, </w:t>
-      </w:r>
-      <w:r>
-        <w:rPr>
-          <w:rStyle w:val="SpecialCharTok"/>
-        </w:rPr>
-        <w:t xml:space="preserve">%s</w:t>
-      </w:r>
-      <w:r>
-        <w:rPr>
-          <w:rStyle w:val="StringTok"/>
-        </w:rPr>
-        <w:t xml:space="preserve">, </w:t>
-      </w:r>
-      <w:r>
-        <w:rPr>
-          <w:rStyle w:val="SpecialCharTok"/>
-        </w:rPr>
-        <w:t xml:space="preserve">%s</w:t>
-      </w:r>
-      <w:r>
-        <w:rPr>
-          <w:rStyle w:val="StringTok"/>
-        </w:rPr>
-        <w:t xml:space="preserve">, </w:t>
-      </w:r>
-      <w:r>
-        <w:rPr>
-          <w:rStyle w:val="SpecialCharTok"/>
-        </w:rPr>
-        <w:t xml:space="preserve">%s</w:t>
-      </w:r>
-      <w:r>
-        <w:rPr>
-          <w:rStyle w:val="StringTok"/>
-        </w:rPr>
-        <w:t xml:space="preserve">, </w:t>
-      </w:r>
-      <w:r>
-        <w:rPr>
-          <w:rStyle w:val="SpecialCharTok"/>
-        </w:rPr>
-        <w:t xml:space="preserve">%s</w:t>
-      </w:r>
-      <w:r>
-        <w:rPr>
-          <w:rStyle w:val="StringTok"/>
-        </w:rPr>
-        <w:t xml:space="preserve">)"</w:t>
-      </w:r>
-      <w:r>
-        <w:rPr>
-          <w:rStyle w:val="NormalTok"/>
-        </w:rPr>
-        <w:t xml:space="preserve">,</w:t>
-      </w:r>
-      <w:r>
-        <w:br/>
-      </w:r>
-      <w:r>
-        <w:rPr>
-          <w:rStyle w:val="NormalTok"/>
-        </w:rPr>
-        <w:t xml:space="preserve">    (new_user_id, roll_number, department, semester, skills))</w:t>
-      </w:r>
-    </w:p>
-    <w:p>
-      <w:pPr>
-        <w:pStyle w:val="FirstParagraph"/>
-      </w:pPr>
-      <w:r>
-        <w:t xml:space="preserve">Reading uses JOINs so one query fetches related data from several tables:</w:t>
-      </w:r>
-    </w:p>
-    <w:p>
-      <w:pPr>
-        <w:pStyle w:val="SourceCode"/>
-      </w:pPr>
-      <w:r>
-        <w:rPr>
-          <w:rStyle w:val="KeywordTok"/>
-        </w:rPr>
-        <w:t xml:space="preserve">SELECT</w:t>
-      </w:r>
-      <w:r>
-        <w:rPr>
-          <w:rStyle w:val="NormalTok"/>
-        </w:rPr>
-        <w:t xml:space="preserve"> applications.</w:t>
-      </w:r>
-      <w:r>
-        <w:rPr>
-          <w:rStyle w:val="KeywordTok"/>
-        </w:rPr>
-        <w:t xml:space="preserve">id</w:t>
-      </w:r>
-      <w:r>
-        <w:rPr>
-          <w:rStyle w:val="NormalTok"/>
-        </w:rPr>
-        <w:t xml:space="preserve">, applications.status,</w:t>
-      </w:r>
-      <w:r>
-        <w:br/>
-      </w:r>
-      <w:r>
-        <w:rPr>
-          <w:rStyle w:val="NormalTok"/>
-        </w:rPr>
-        <w:t xml:space="preserve">       internships.title, users.name </w:t>
-      </w:r>
-      <w:r>
-        <w:rPr>
-          <w:rStyle w:val="KeywordTok"/>
-        </w:rPr>
-        <w:t xml:space="preserve">AS</w:t>
-      </w:r>
-      <w:r>
-        <w:rPr>
-          <w:rStyle w:val="NormalTok"/>
-        </w:rPr>
-        <w:t xml:space="preserve"> company_name</w:t>
-      </w:r>
-      <w:r>
-        <w:br/>
-      </w:r>
-      <w:r>
-        <w:rPr>
-          <w:rStyle w:val="KeywordTok"/>
-        </w:rPr>
-        <w:t xml:space="preserve">FROM</w:t>
-      </w:r>
-      <w:r>
-        <w:rPr>
-          <w:rStyle w:val="NormalTok"/>
-        </w:rPr>
-        <w:t xml:space="preserve"> applications</w:t>
-      </w:r>
-      <w:r>
-        <w:br/>
-      </w:r>
-      <w:r>
-        <w:rPr>
-          <w:rStyle w:val="KeywordTok"/>
-        </w:rPr>
-        <w:t xml:space="preserve">JOIN</w:t>
-      </w:r>
-      <w:r>
-        <w:rPr>
-          <w:rStyle w:val="NormalTok"/>
-        </w:rPr>
-        <w:t xml:space="preserve"> internships </w:t>
-      </w:r>
-      <w:r>
-        <w:rPr>
-          <w:rStyle w:val="KeywordTok"/>
-        </w:rPr>
-        <w:t xml:space="preserve">ON</w:t>
-      </w:r>
-      <w:r>
-        <w:rPr>
-          <w:rStyle w:val="NormalTok"/>
-        </w:rPr>
-        <w:t xml:space="preserve"> applications.internship_id </w:t>
-      </w:r>
-      <w:r>
-        <w:rPr>
-          <w:rStyle w:val="OperatorTok"/>
-        </w:rPr>
-        <w:t xml:space="preserve">=</w:t>
-      </w:r>
-      <w:r>
-        <w:rPr>
-          <w:rStyle w:val="NormalTok"/>
-        </w:rPr>
-        <w:t xml:space="preserve"> internships.</w:t>
-      </w:r>
-      <w:r>
-        <w:rPr>
-          <w:rStyle w:val="KeywordTok"/>
-        </w:rPr>
-        <w:t xml:space="preserve">id</w:t>
-      </w:r>
-      <w:r>
-        <w:br/>
-      </w:r>
-      <w:r>
-        <w:rPr>
-          <w:rStyle w:val="KeywordTok"/>
-        </w:rPr>
-        <w:t xml:space="preserve">JOIN</w:t>
-      </w:r>
-      <w:r>
-        <w:rPr>
-          <w:rStyle w:val="NormalTok"/>
-        </w:rPr>
-        <w:t xml:space="preserve"> companies   </w:t>
-      </w:r>
-      <w:r>
-        <w:rPr>
-          <w:rStyle w:val="KeywordTok"/>
-        </w:rPr>
-        <w:t xml:space="preserve">ON</w:t>
-      </w:r>
-      <w:r>
-        <w:rPr>
-          <w:rStyle w:val="NormalTok"/>
-        </w:rPr>
-        <w:t xml:space="preserve"> internships.company_id </w:t>
-      </w:r>
-      <w:r>
-        <w:rPr>
-          <w:rStyle w:val="OperatorTok"/>
-        </w:rPr>
-        <w:t xml:space="preserve">=</w:t>
-      </w:r>
-      <w:r>
-        <w:rPr>
-          <w:rStyle w:val="NormalTok"/>
-        </w:rPr>
-        <w:t xml:space="preserve"> companies.</w:t>
-      </w:r>
-      <w:r>
-        <w:rPr>
-          <w:rStyle w:val="KeywordTok"/>
-        </w:rPr>
-        <w:t xml:space="preserve">id</w:t>
-      </w:r>
-      <w:r>
-        <w:br/>
-      </w:r>
-      <w:r>
-        <w:rPr>
-          <w:rStyle w:val="KeywordTok"/>
-        </w:rPr>
-        <w:t xml:space="preserve">JOIN</w:t>
-      </w:r>
-      <w:r>
-        <w:rPr>
-          <w:rStyle w:val="NormalTok"/>
-        </w:rPr>
-        <w:t xml:space="preserve"> users       </w:t>
-      </w:r>
-      <w:r>
-        <w:rPr>
-          <w:rStyle w:val="KeywordTok"/>
-        </w:rPr>
-        <w:t xml:space="preserve">ON</w:t>
-      </w:r>
-      <w:r>
-        <w:rPr>
-          <w:rStyle w:val="NormalTok"/>
-        </w:rPr>
-        <w:t xml:space="preserve"> companies.user_id </w:t>
-      </w:r>
-      <w:r>
-        <w:rPr>
-          <w:rStyle w:val="OperatorTok"/>
-        </w:rPr>
-        <w:t xml:space="preserve">=</w:t>
-      </w:r>
-      <w:r>
-        <w:rPr>
-          <w:rStyle w:val="NormalTok"/>
-        </w:rPr>
-        <w:t xml:space="preserve"> users.</w:t>
-      </w:r>
-      <w:r>
-        <w:rPr>
-          <w:rStyle w:val="KeywordTok"/>
-        </w:rPr>
-        <w:t xml:space="preserve">id</w:t>
-      </w:r>
-      <w:r>
-        <w:br/>
-      </w:r>
-      <w:r>
-        <w:rPr>
-          <w:rStyle w:val="KeywordTok"/>
-        </w:rPr>
-        <w:t xml:space="preserve">WHERE</w:t>
-      </w:r>
-      <w:r>
-        <w:rPr>
-          <w:rStyle w:val="NormalTok"/>
-        </w:rPr>
-        <w:t xml:space="preserve"> applications.student_id </w:t>
-      </w:r>
-      <w:r>
-        <w:rPr>
-          <w:rStyle w:val="OperatorTok"/>
-        </w:rPr>
-        <w:t xml:space="preserve">=</w:t>
-      </w:r>
-      <w:r>
-        <w:rPr>
-          <w:rStyle w:val="NormalTok"/>
-        </w:rPr>
-        <w:t xml:space="preserve"> %s</w:t>
-      </w:r>
-    </w:p>
-    <w:p>
-      <w:pPr>
-        <w:pStyle w:val="FirstParagraph"/>
-      </w:pPr>
-      <w:r>
-        <w:t xml:space="preserve">Code efficiency measures: parameterized queries (</w:t>
+        <w:t xml:space="preserve"> </w:t>
       </w:r>
       <w:r>
         <w:rPr>
           <w:rStyle w:val="VerbatimChar"/>
         </w:rPr>
-        <w:t xml:space="preserve">%s</w:t>
-      </w:r>
-      <w:r>
-        <w:t xml:space="preserve">) prevent SQL</w:t>
-      </w:r>
-      <w:r>
-        <w:t xml:space="preserve"> </w:t>
-      </w:r>
-      <w:r>
-        <w:t xml:space="preserve">injection; JOINs avoid multiple round trips to the database;</w:t>
-      </w:r>
-      <w:r>
-        <w:t xml:space="preserve"> </w:t>
-      </w:r>
-      <w:r>
-        <w:rPr>
-          <w:rStyle w:val="VerbatimChar"/>
-        </w:rPr>
-        <w:t xml:space="preserve">ON DELETE CASCADE</w:t>
-      </w:r>
-      <w:r>
-        <w:t xml:space="preserve"> </w:t>
-      </w:r>
-      <w:r>
-        <w:t xml:space="preserve">lets the database clean up related rows instead of many DELETE</w:t>
-      </w:r>
-      <w:r>
-        <w:t xml:space="preserve"> </w:t>
-      </w:r>
-      <w:r>
-        <w:t xml:space="preserve">statements; and shared helpers (</w:t>
-      </w:r>
-      <w:r>
-        <w:rPr>
-          <w:rStyle w:val="VerbatimChar"/>
-        </w:rPr>
-        <w:t xml:space="preserve">get_db()</w:t>
-      </w:r>
-      <w:r>
-        <w:t xml:space="preserve">,</w:t>
-      </w:r>
-      <w:r>
-        <w:t xml:space="preserve"> </w:t>
-      </w:r>
-      <w:r>
-        <w:rPr>
-          <w:rStyle w:val="VerbatimChar"/>
-        </w:rPr>
-        <w:t xml:space="preserve">my_student()</w:t>
-      </w:r>
-      <w:r>
-        <w:t xml:space="preserve">,</w:t>
-      </w:r>
-      <w:r>
-        <w:t xml:space="preserve"> </w:t>
-      </w:r>
-      <w:r>
-        <w:rPr>
-          <w:rStyle w:val="VerbatimChar"/>
-        </w:rPr>
-        <w:t xml:space="preserve">my_company()</w:t>
-      </w:r>
-      <w:r>
-        <w:t xml:space="preserve">,</w:t>
-      </w:r>
-      <w:r>
-        <w:t xml:space="preserve"> </w:t>
-      </w:r>
-      <w:r>
-        <w:rPr>
-          <w:rStyle w:val="VerbatimChar"/>
-        </w:rPr>
-        <w:t xml:space="preserve">my_supervisor()</w:t>
-      </w:r>
-      <w:r>
-        <w:t xml:space="preserve">) avoid repeated code.</w:t>
+        <w:t xml:space="preserve">current_supervisor()</w:t>
+      </w:r>
+      <w:r>
+        <w:t xml:space="preserve">) avoid repeated code; and</w:t>
+      </w:r>
+      <w:r>
+        <w:t xml:space="preserve"> </w:t>
+      </w:r>
+      <w:r>
+        <w:t xml:space="preserve">model classes mirror the UML class diagram one-to-one.</w:t>
       </w:r>
     </w:p>
     <w:bookmarkEnd w:id="70"/>
@@ -8733,25 +8710,25 @@
         <w:t xml:space="preserve"> </w:t>
       </w:r>
       <w:r>
-        <w:t xml:space="preserve">operations implemented through raw SQL queries. The complete internship</w:t>
-      </w:r>
-      <w:r>
-        <w:t xml:space="preserve"> </w:t>
-      </w:r>
-      <w:r>
-        <w:t xml:space="preserve">workflow — from a company posting an internship to a supervisor marking a</w:t>
-      </w:r>
-      <w:r>
-        <w:t xml:space="preserve"> </w:t>
-      </w:r>
-      <w:r>
-        <w:t xml:space="preserve">student’s weekly log — works end to end with role-based access control,</w:t>
-      </w:r>
-      <w:r>
-        <w:t xml:space="preserve"> </w:t>
-      </w:r>
-      <w:r>
-        <w:t xml:space="preserve">hashed passwords and parameterized queries.</w:t>
+        <w:t xml:space="preserve">operations implemented through the SQLAlchemy ORM, where every table is a</w:t>
+      </w:r>
+      <w:r>
+        <w:t xml:space="preserve"> </w:t>
+      </w:r>
+      <w:r>
+        <w:t xml:space="preserve">Python model class. The complete internship workflow — from a company</w:t>
+      </w:r>
+      <w:r>
+        <w:t xml:space="preserve"> </w:t>
+      </w:r>
+      <w:r>
+        <w:t xml:space="preserve">posting an internship to a supervisor marking a student’s weekly log —</w:t>
+      </w:r>
+      <w:r>
+        <w:t xml:space="preserve"> </w:t>
+      </w:r>
+      <w:r>
+        <w:t xml:space="preserve">works end to end with role-based access control and hashed passwords.</w:t>
       </w:r>
     </w:p>
     <w:bookmarkEnd w:id="78"/>

</xml_diff>

<commit_message>
Add system architecture diagram to documentation (Figure 4.2.1)
Co-Authored-By: Claude Fable 5 <noreply@anthropic.com>
Claude-Session: https://claude.ai/code/session_013xPLnyFTSjbxMiATP4c7ND
</commit_message>
<xml_diff>
--- a/docs/Project_Documentation.docx
+++ b/docs/Project_Documentation.docx
@@ -3899,7 +3899,7 @@
     <w:bookmarkEnd w:id="61"/>
     <w:bookmarkEnd w:id="62"/>
     <w:bookmarkEnd w:id="63"/>
-    <w:bookmarkStart w:id="68" w:name="chapter-4-design"/>
+    <w:bookmarkStart w:id="71" w:name="chapter-4-design"/>
     <w:p>
       <w:pPr>
         <w:pStyle w:val="Heading1"/>
@@ -3932,7 +3932,7 @@
       </w:r>
     </w:p>
     <w:bookmarkEnd w:id="64"/>
-    <w:bookmarkStart w:id="65" w:name="system-design"/>
+    <w:bookmarkStart w:id="68" w:name="system-design"/>
     <w:p>
       <w:pPr>
         <w:pStyle w:val="Heading2"/>
@@ -3946,18 +3946,68 @@
         <w:pStyle w:val="FirstParagraph"/>
       </w:pPr>
       <w:r>
-        <w:t xml:space="preserve">The system uses a simple three-layer architecture:</w:t>
-      </w:r>
-    </w:p>
-    <w:p>
-      <w:pPr>
-        <w:pStyle w:val="SourceCode"/>
-      </w:pPr>
-      <w:r>
-        <w:rPr>
-          <w:rStyle w:val="VerbatimChar"/>
-        </w:rPr>
-        <w:t xml:space="preserve">Browser (HTML/CSS)  &lt;--&gt;  Flask (Python, routes/)  &lt;--&gt;  MySQL (database)</w:t>
+        <w:t xml:space="preserve">The system uses a three-layer architecture: the presentation layer (the</w:t>
+      </w:r>
+      <w:r>
+        <w:t xml:space="preserve"> </w:t>
+      </w:r>
+      <w:r>
+        <w:t xml:space="preserve">web browser), the application layer (Flask), and the data layer (MySQL).</w:t>
+      </w:r>
+    </w:p>
+    <w:p>
+      <w:pPr>
+        <w:pStyle w:val="CaptionedFigure"/>
+      </w:pPr>
+      <w:r>
+        <w:drawing>
+          <wp:inline>
+            <wp:extent cx="5334000" cy="4038600"/>
+            <wp:effectExtent b="0" l="0" r="0" t="0"/>
+            <wp:docPr descr="Figure 4.2.1: System Architecture" title="" id="66" name="Picture"/>
+            <a:graphic>
+              <a:graphicData uri="http://schemas.openxmlformats.org/drawingml/2006/picture">
+                <pic:pic>
+                  <pic:nvPicPr>
+                    <pic:cNvPr descr="system_architecture.png" id="67" name="Picture"/>
+                    <pic:cNvPicPr>
+                      <a:picLocks noChangeArrowheads="1" noChangeAspect="1"/>
+                    </pic:cNvPicPr>
+                  </pic:nvPicPr>
+                  <pic:blipFill>
+                    <a:blip r:embed="rId65"/>
+                    <a:stretch>
+                      <a:fillRect/>
+                    </a:stretch>
+                  </pic:blipFill>
+                  <pic:spPr bwMode="auto">
+                    <a:xfrm>
+                      <a:off x="0" y="0"/>
+                      <a:ext cx="5334000" cy="4038600"/>
+                    </a:xfrm>
+                    <a:prstGeom prst="rect">
+                      <a:avLst/>
+                    </a:prstGeom>
+                    <a:noFill/>
+                    <a:ln w="9525">
+                      <a:noFill/>
+                      <a:headEnd/>
+                      <a:tailEnd/>
+                    </a:ln>
+                  </pic:spPr>
+                </pic:pic>
+              </a:graphicData>
+            </a:graphic>
+          </wp:inline>
+        </w:drawing>
+      </w:r>
+    </w:p>
+    <w:p>
+      <w:pPr>
+        <w:pStyle w:val="ImageCaption"/>
+      </w:pPr>
+      <w:r>
+        <w:t xml:space="preserve">Figure 4.2.1: System Architecture</w:t>
       </w:r>
     </w:p>
     <w:p>
@@ -4153,8 +4203,8 @@
         <w:t xml:space="preserve">└── templates/          HTML pages (all extend base.html)</w:t>
       </w:r>
     </w:p>
-    <w:bookmarkEnd w:id="65"/>
-    <w:bookmarkStart w:id="66" w:name="database-design"/>
+    <w:bookmarkEnd w:id="68"/>
+    <w:bookmarkStart w:id="69" w:name="database-design"/>
     <w:p>
       <w:pPr>
         <w:pStyle w:val="Heading2"/>
@@ -6538,8 +6588,8 @@
         </w:tc>
       </w:tr>
     </w:tbl>
-    <w:bookmarkEnd w:id="66"/>
-    <w:bookmarkStart w:id="67" w:name="interface-design"/>
+    <w:bookmarkEnd w:id="69"/>
+    <w:bookmarkStart w:id="70" w:name="interface-design"/>
     <w:p>
       <w:pPr>
         <w:pStyle w:val="Heading2"/>
@@ -6625,9 +6675,9 @@
         <w:t xml:space="preserve">management ]</w:t>
       </w:r>
     </w:p>
-    <w:bookmarkEnd w:id="67"/>
-    <w:bookmarkEnd w:id="68"/>
-    <w:bookmarkStart w:id="74" w:name="chapter-5-implementation-and-testing"/>
+    <w:bookmarkEnd w:id="70"/>
+    <w:bookmarkEnd w:id="71"/>
+    <w:bookmarkStart w:id="77" w:name="chapter-5-implementation-and-testing"/>
     <w:p>
       <w:pPr>
         <w:pStyle w:val="Heading1"/>
@@ -6636,7 +6686,7 @@
         <w:t xml:space="preserve">CHAPTER 5: IMPLEMENTATION AND TESTING</w:t>
       </w:r>
     </w:p>
-    <w:bookmarkStart w:id="69" w:name="implementation-approach"/>
+    <w:bookmarkStart w:id="72" w:name="implementation-approach"/>
     <w:p>
       <w:pPr>
         <w:pStyle w:val="Heading2"/>
@@ -6802,8 +6852,8 @@
         <w:t xml:space="preserve">before showing anything.</w:t>
       </w:r>
     </w:p>
-    <w:bookmarkEnd w:id="69"/>
-    <w:bookmarkStart w:id="70" w:name="coding-details-and-code-efficiency"/>
+    <w:bookmarkEnd w:id="72"/>
+    <w:bookmarkStart w:id="73" w:name="coding-details-and-code-efficiency"/>
     <w:p>
       <w:pPr>
         <w:pStyle w:val="Heading2"/>
@@ -7511,8 +7561,8 @@
         <w:t xml:space="preserve">model classes mirror the UML class diagram one-to-one.</w:t>
       </w:r>
     </w:p>
-    <w:bookmarkEnd w:id="70"/>
-    <w:bookmarkStart w:id="71" w:name="testing-approach"/>
+    <w:bookmarkEnd w:id="73"/>
+    <w:bookmarkStart w:id="74" w:name="testing-approach"/>
     <w:p>
       <w:pPr>
         <w:pStyle w:val="Heading2"/>
@@ -7553,8 +7603,8 @@
         <w:t xml:space="preserve">correctly.</w:t>
       </w:r>
     </w:p>
-    <w:bookmarkEnd w:id="71"/>
-    <w:bookmarkStart w:id="72" w:name="modifications-and-improvements"/>
+    <w:bookmarkEnd w:id="74"/>
+    <w:bookmarkStart w:id="75" w:name="modifications-and-improvements"/>
     <w:p>
       <w:pPr>
         <w:pStyle w:val="Heading2"/>
@@ -7667,8 +7717,8 @@
         <w:t xml:space="preserve">The CSS was refined with variables so the whole color scheme can be changed in one place.</w:t>
       </w:r>
     </w:p>
-    <w:bookmarkEnd w:id="72"/>
-    <w:bookmarkStart w:id="73" w:name="test-cases"/>
+    <w:bookmarkEnd w:id="75"/>
+    <w:bookmarkStart w:id="76" w:name="test-cases"/>
     <w:p>
       <w:pPr>
         <w:pStyle w:val="Heading2"/>
@@ -8511,9 +8561,9 @@
         </w:tc>
       </w:tr>
     </w:tbl>
-    <w:bookmarkEnd w:id="73"/>
-    <w:bookmarkEnd w:id="74"/>
-    <w:bookmarkStart w:id="77" w:name="chapter-6-results-and-discussion"/>
+    <w:bookmarkEnd w:id="76"/>
+    <w:bookmarkEnd w:id="77"/>
+    <w:bookmarkStart w:id="80" w:name="chapter-6-results-and-discussion"/>
     <w:p>
       <w:pPr>
         <w:pStyle w:val="Heading1"/>
@@ -8522,7 +8572,7 @@
         <w:t xml:space="preserve">CHAPTER 6: RESULTS AND DISCUSSION</w:t>
       </w:r>
     </w:p>
-    <w:bookmarkStart w:id="75" w:name="test-reports"/>
+    <w:bookmarkStart w:id="78" w:name="test-reports"/>
     <w:p>
       <w:pPr>
         <w:pStyle w:val="Heading2"/>
@@ -8575,8 +8625,8 @@
         <w:t xml:space="preserve">pages of other roles, which correctly redirect away.</w:t>
       </w:r>
     </w:p>
-    <w:bookmarkEnd w:id="75"/>
-    <w:bookmarkStart w:id="76" w:name="user-documentation"/>
+    <w:bookmarkEnd w:id="78"/>
+    <w:bookmarkStart w:id="79" w:name="user-documentation"/>
     <w:p>
       <w:pPr>
         <w:pStyle w:val="Heading2"/>
@@ -8673,9 +8723,9 @@
         <w:t xml:space="preserve">Login (default account: admin@portal.com) → Users page lists everyone → delete a user if needed.</w:t>
       </w:r>
     </w:p>
-    <w:bookmarkEnd w:id="76"/>
-    <w:bookmarkEnd w:id="77"/>
-    <w:bookmarkStart w:id="82" w:name="chapter-7-conclusion"/>
+    <w:bookmarkEnd w:id="79"/>
+    <w:bookmarkEnd w:id="80"/>
+    <w:bookmarkStart w:id="85" w:name="chapter-7-conclusion"/>
     <w:p>
       <w:pPr>
         <w:pStyle w:val="Heading1"/>
@@ -8684,7 +8734,7 @@
         <w:t xml:space="preserve">CHAPTER 7: CONCLUSION</w:t>
       </w:r>
     </w:p>
-    <w:bookmarkStart w:id="78" w:name="conclusion"/>
+    <w:bookmarkStart w:id="81" w:name="conclusion"/>
     <w:p>
       <w:pPr>
         <w:pStyle w:val="Heading2"/>
@@ -8731,8 +8781,8 @@
         <w:t xml:space="preserve">works end to end with role-based access control and hashed passwords.</w:t>
       </w:r>
     </w:p>
-    <w:bookmarkEnd w:id="78"/>
-    <w:bookmarkStart w:id="79" w:name="limitations"/>
+    <w:bookmarkEnd w:id="81"/>
+    <w:bookmarkStart w:id="82" w:name="limitations"/>
     <w:p>
       <w:pPr>
         <w:pStyle w:val="Heading2"/>
@@ -8789,8 +8839,8 @@
         <w:t xml:space="preserve">The system runs on a local development server, not a live deployment.</w:t>
       </w:r>
     </w:p>
-    <w:bookmarkEnd w:id="79"/>
-    <w:bookmarkStart w:id="80" w:name="future-scope"/>
+    <w:bookmarkEnd w:id="82"/>
+    <w:bookmarkStart w:id="83" w:name="future-scope"/>
     <w:p>
       <w:pPr>
         <w:pStyle w:val="Heading2"/>
@@ -8859,8 +8909,8 @@
         <w:t xml:space="preserve">Deployment on a live server with a production database.</w:t>
       </w:r>
     </w:p>
-    <w:bookmarkEnd w:id="80"/>
-    <w:bookmarkStart w:id="81" w:name="references"/>
+    <w:bookmarkEnd w:id="83"/>
+    <w:bookmarkStart w:id="84" w:name="references"/>
     <w:p>
       <w:pPr>
         <w:pStyle w:val="Heading2"/>
@@ -8929,8 +8979,8 @@
         <w:t xml:space="preserve">Werkzeug Documentation — https://werkzeug.palletsprojects.com/</w:t>
       </w:r>
     </w:p>
-    <w:bookmarkEnd w:id="81"/>
-    <w:bookmarkEnd w:id="82"/>
+    <w:bookmarkEnd w:id="84"/>
+    <w:bookmarkEnd w:id="85"/>
     <w:sectPr/>
   </w:body>
 </w:document>

</xml_diff>

<commit_message>
Add request-flow walkthrough to system design section
Co-Authored-By: Claude Fable 5 <noreply@anthropic.com>
Claude-Session: https://claude.ai/code/session_013xPLnyFTSjbxMiATP4c7ND
</commit_message>
<xml_diff>
--- a/docs/Project_Documentation.docx
+++ b/docs/Project_Documentation.docx
@@ -4073,12 +4073,233 @@
         <w:pStyle w:val="Compact"/>
       </w:pPr>
       <w:r>
-        <w:t xml:space="preserve">The function executes SQL on MySQL through PyMySQL and renders an HTML template with the result.</w:t>
+        <w:t xml:space="preserve">The function reads or changes data through the SQLAlchemy ORM, which sends the SQL to MySQL, and renders an HTML template with the result.</w:t>
       </w:r>
     </w:p>
     <w:p>
       <w:pPr>
         <w:pStyle w:val="FirstParagraph"/>
+      </w:pPr>
+      <w:r>
+        <w:rPr>
+          <w:bCs/>
+          <w:b/>
+        </w:rPr>
+        <w:t xml:space="preserve">Example — how one request flows through the system.</w:t>
+      </w:r>
+      <w:r>
+        <w:t xml:space="preserve"> </w:t>
+      </w:r>
+      <w:r>
+        <w:t xml:space="preserve">When a student</w:t>
+      </w:r>
+      <w:r>
+        <w:t xml:space="preserve"> </w:t>
+      </w:r>
+      <w:r>
+        <w:t xml:space="preserve">clicks</w:t>
+      </w:r>
+      <w:r>
+        <w:t xml:space="preserve"> </w:t>
+      </w:r>
+      <w:r>
+        <w:rPr>
+          <w:iCs/>
+          <w:i/>
+        </w:rPr>
+        <w:t xml:space="preserve">Apply</w:t>
+      </w:r>
+      <w:r>
+        <w:t xml:space="preserve"> </w:t>
+      </w:r>
+      <w:r>
+        <w:t xml:space="preserve">on an internship, the browser sends an HTTP POST request to</w:t>
+      </w:r>
+      <w:r>
+        <w:t xml:space="preserve"> </w:t>
+      </w:r>
+      <w:r>
+        <w:rPr>
+          <w:rStyle w:val="VerbatimChar"/>
+        </w:rPr>
+        <w:t xml:space="preserve">/apply/5</w:t>
+      </w:r>
+      <w:r>
+        <w:t xml:space="preserve">. In the application layer,</w:t>
+      </w:r>
+      <w:r>
+        <w:t xml:space="preserve"> </w:t>
+      </w:r>
+      <w:r>
+        <w:rPr>
+          <w:rStyle w:val="VerbatimChar"/>
+        </w:rPr>
+        <w:t xml:space="preserve">app.py</w:t>
+      </w:r>
+      <w:r>
+        <w:t xml:space="preserve"> </w:t>
+      </w:r>
+      <w:r>
+        <w:t xml:space="preserve">matches this URL and calls</w:t>
+      </w:r>
+      <w:r>
+        <w:t xml:space="preserve"> </w:t>
+      </w:r>
+      <w:r>
+        <w:t xml:space="preserve">the</w:t>
+      </w:r>
+      <w:r>
+        <w:t xml:space="preserve"> </w:t>
+      </w:r>
+      <w:r>
+        <w:rPr>
+          <w:rStyle w:val="VerbatimChar"/>
+        </w:rPr>
+        <w:t xml:space="preserve">apply()</w:t>
+      </w:r>
+      <w:r>
+        <w:t xml:space="preserve"> </w:t>
+      </w:r>
+      <w:r>
+        <w:t xml:space="preserve">function in</w:t>
+      </w:r>
+      <w:r>
+        <w:t xml:space="preserve"> </w:t>
+      </w:r>
+      <w:r>
+        <w:rPr>
+          <w:rStyle w:val="VerbatimChar"/>
+        </w:rPr>
+        <w:t xml:space="preserve">routes/student.py</w:t>
+      </w:r>
+      <w:r>
+        <w:t xml:space="preserve">. The function first checks</w:t>
+      </w:r>
+      <w:r>
+        <w:t xml:space="preserve"> </w:t>
+      </w:r>
+      <w:r>
+        <w:t xml:space="preserve">the Flask session to confirm the logged-in user is a student, then creates</w:t>
+      </w:r>
+      <w:r>
+        <w:t xml:space="preserve"> </w:t>
+      </w:r>
+      <w:r>
+        <w:t xml:space="preserve">an</w:t>
+      </w:r>
+      <w:r>
+        <w:t xml:space="preserve"> </w:t>
+      </w:r>
+      <w:r>
+        <w:rPr>
+          <w:rStyle w:val="VerbatimChar"/>
+        </w:rPr>
+        <w:t xml:space="preserve">Application</w:t>
+      </w:r>
+      <w:r>
+        <w:t xml:space="preserve"> </w:t>
+      </w:r>
+      <w:r>
+        <w:t xml:space="preserve">model object with the student’s id, the internship id and</w:t>
+      </w:r>
+      <w:r>
+        <w:t xml:space="preserve"> </w:t>
+      </w:r>
+      <w:r>
+        <w:t xml:space="preserve">the cover letter, and calls</w:t>
+      </w:r>
+      <w:r>
+        <w:t xml:space="preserve"> </w:t>
+      </w:r>
+      <w:r>
+        <w:rPr>
+          <w:rStyle w:val="VerbatimChar"/>
+        </w:rPr>
+        <w:t xml:space="preserve">db.session.add()</w:t>
+      </w:r>
+      <w:r>
+        <w:t xml:space="preserve"> </w:t>
+      </w:r>
+      <w:r>
+        <w:t xml:space="preserve">and</w:t>
+      </w:r>
+      <w:r>
+        <w:t xml:space="preserve"> </w:t>
+      </w:r>
+      <w:r>
+        <w:rPr>
+          <w:rStyle w:val="VerbatimChar"/>
+        </w:rPr>
+        <w:t xml:space="preserve">db.session.commit()</w:t>
+      </w:r>
+      <w:r>
+        <w:t xml:space="preserve">.</w:t>
+      </w:r>
+      <w:r>
+        <w:t xml:space="preserve"> </w:t>
+      </w:r>
+      <w:r>
+        <w:t xml:space="preserve">SQLAlchemy generates the corresponding</w:t>
+      </w:r>
+      <w:r>
+        <w:t xml:space="preserve"> </w:t>
+      </w:r>
+      <w:r>
+        <w:rPr>
+          <w:rStyle w:val="VerbatimChar"/>
+        </w:rPr>
+        <w:t xml:space="preserve">INSERT</w:t>
+      </w:r>
+      <w:r>
+        <w:t xml:space="preserve"> </w:t>
+      </w:r>
+      <w:r>
+        <w:t xml:space="preserve">statement and sends it to</w:t>
+      </w:r>
+      <w:r>
+        <w:t xml:space="preserve"> </w:t>
+      </w:r>
+      <w:r>
+        <w:t xml:space="preserve">MySQL with all values as bound parameters. Finally the function redirects</w:t>
+      </w:r>
+      <w:r>
+        <w:t xml:space="preserve"> </w:t>
+      </w:r>
+      <w:r>
+        <w:t xml:space="preserve">the browser to the</w:t>
+      </w:r>
+      <w:r>
+        <w:t xml:space="preserve"> </w:t>
+      </w:r>
+      <w:r>
+        <w:rPr>
+          <w:iCs/>
+          <w:i/>
+        </w:rPr>
+        <w:t xml:space="preserve">My Applications</w:t>
+      </w:r>
+      <w:r>
+        <w:t xml:space="preserve"> </w:t>
+      </w:r>
+      <w:r>
+        <w:t xml:space="preserve">page, whose query returns the new</w:t>
+      </w:r>
+      <w:r>
+        <w:t xml:space="preserve"> </w:t>
+      </w:r>
+      <w:r>
+        <w:t xml:space="preserve">application as a Python object and the template renders it as HTML. Every</w:t>
+      </w:r>
+      <w:r>
+        <w:t xml:space="preserve"> </w:t>
+      </w:r>
+      <w:r>
+        <w:t xml:space="preserve">page of the system follows this same path through the three layers.</w:t>
+      </w:r>
+    </w:p>
+    <w:p>
+      <w:pPr>
+        <w:pStyle w:val="BodyText"/>
       </w:pPr>
       <w:r>
         <w:t xml:space="preserve">The project is organized as follows:</w:t>

</xml_diff>

<commit_message>
Sync documentation with document upload and search features
Co-Authored-By: Claude Fable 5 <noreply@anthropic.com>
Claude-Session: https://claude.ai/code/session_013xPLnyFTSjbxMiATP4c7ND
</commit_message>
<xml_diff>
--- a/docs/Project_Documentation.docx
+++ b/docs/Project_Documentation.docx
@@ -2807,6 +2807,50 @@
       </w:r>
       <w:r>
         <w:t xml:space="preserve">The system shall show each role a dashboard with statistics relevant to that role, and a public landing page with overall counts.</w:t>
+      </w:r>
+    </w:p>
+    <w:p>
+      <w:pPr>
+        <w:numPr>
+          <w:ilvl w:val="0"/>
+          <w:numId w:val="1008"/>
+        </w:numPr>
+        <w:pStyle w:val="Compact"/>
+      </w:pPr>
+      <w:r>
+        <w:rPr>
+          <w:bCs/>
+          <w:b/>
+        </w:rPr>
+        <w:t xml:space="preserve">FR-16:</w:t>
+      </w:r>
+      <w:r>
+        <w:t xml:space="preserve"> </w:t>
+      </w:r>
+      <w:r>
+        <w:t xml:space="preserve">A student shall be required to upload an identity document (pdf or image) during registration; the document shall be visible to companies.</w:t>
+      </w:r>
+    </w:p>
+    <w:p>
+      <w:pPr>
+        <w:numPr>
+          <w:ilvl w:val="0"/>
+          <w:numId w:val="1008"/>
+        </w:numPr>
+        <w:pStyle w:val="Compact"/>
+      </w:pPr>
+      <w:r>
+        <w:rPr>
+          <w:bCs/>
+          <w:b/>
+        </w:rPr>
+        <w:t xml:space="preserve">FR-17:</w:t>
+      </w:r>
+      <w:r>
+        <w:t xml:space="preserve"> </w:t>
+      </w:r>
+      <w:r>
+        <w:t xml:space="preserve">The system shall allow internships to be searched by keyword (title, description, skills) and filtered by skill.</w:t>
       </w:r>
     </w:p>
     <w:bookmarkEnd w:id="41"/>
@@ -9021,7 +9065,7 @@
         <w:pStyle w:val="Compact"/>
       </w:pPr>
       <w:r>
-        <w:t xml:space="preserve">No file uploads yet (resume, verification documents, log attachments).</w:t>
+        <w:t xml:space="preserve">Resume uploads and weekly log attachments are not yet supported (identity documents are uploaded at registration).</w:t>
       </w:r>
     </w:p>
     <w:p>
@@ -9033,7 +9077,7 @@
         <w:pStyle w:val="Compact"/>
       </w:pPr>
       <w:r>
-        <w:t xml:space="preserve">Search supports only internship titles; there are no advanced filters.</w:t>
+        <w:t xml:space="preserve">Search supports keywords and skills; filters by duration and stipend are not yet available.</w:t>
       </w:r>
     </w:p>
     <w:p>
@@ -9079,7 +9123,7 @@
         <w:pStyle w:val="Compact"/>
       </w:pPr>
       <w:r>
-        <w:t xml:space="preserve">Resume and document upload for students.</w:t>
+        <w:t xml:space="preserve">Resume upload and weekly log attachments for students.</w:t>
       </w:r>
     </w:p>
     <w:p>
@@ -9091,7 +9135,7 @@
         <w:pStyle w:val="Compact"/>
       </w:pPr>
       <w:r>
-        <w:t xml:space="preserve">Search and filter by skills, duration and stipend.</w:t>
+        <w:t xml:space="preserve">Filtering of internships by duration and stipend.</w:t>
       </w:r>
     </w:p>
     <w:p>

</xml_diff>

<commit_message>
Replace plain CSS with Bootstrap 5 across all templates
Bootstrap 5 vendored locally in static/ (works without internet): dark
navbar with responsive collapse, card layouts, striped bordered tables,
status badges, Bootstrap forms and grid. Custom stylesheet reduced to a
small additions file. Docs updated to match.

Co-Authored-By: Claude Fable 5 <noreply@anthropic.com>
Claude-Session: https://claude.ai/code/session_013xPLnyFTSjbxMiATP4c7ND
</commit_message>
<xml_diff>
--- a/docs/Project_Documentation.docx
+++ b/docs/Project_Documentation.docx
@@ -2321,13 +2321,35 @@
           <w:bCs/>
           <w:b/>
         </w:rPr>
+        <w:t xml:space="preserve">Bootstrap 5</w:t>
+      </w:r>
+      <w:r>
+        <w:t xml:space="preserve"> </w:t>
+      </w:r>
+      <w:r>
+        <w:t xml:space="preserve">— CSS framework used for the navigation bar, cards, tables, badges, forms and responsive grid; served locally from the static folder so the system works without internet.</w:t>
+      </w:r>
+    </w:p>
+    <w:p>
+      <w:pPr>
+        <w:numPr>
+          <w:ilvl w:val="0"/>
+          <w:numId w:val="1006"/>
+        </w:numPr>
+        <w:pStyle w:val="Compact"/>
+      </w:pPr>
+      <w:r>
+        <w:rPr>
+          <w:bCs/>
+          <w:b/>
+        </w:rPr>
         <w:t xml:space="preserve">CSS</w:t>
       </w:r>
       <w:r>
         <w:t xml:space="preserve"> </w:t>
       </w:r>
       <w:r>
-        <w:t xml:space="preserve">— plain custom stylesheet (no framework), with colors defined once as variables.</w:t>
+        <w:t xml:space="preserve">— a small custom stylesheet for additions such as preserving line breaks in long text.</w:t>
       </w:r>
     </w:p>
     <w:p>
@@ -4456,7 +4478,7 @@
         <w:rPr>
           <w:rStyle w:val="VerbatimChar"/>
         </w:rPr>
-        <w:t xml:space="preserve">├── static/style.css    all styling (plain CSS)</w:t>
+        <w:t xml:space="preserve">├── static/             Bootstrap 5 (local) + small custom stylesheet</w:t>
       </w:r>
       <w:r>
         <w:br/>
@@ -6883,7 +6905,7 @@
         <w:t xml:space="preserve"> </w:t>
       </w:r>
       <w:r>
-        <w:t xml:space="preserve">that changes according to the logged-in role, and a plain CSS stylesheet.</w:t>
+        <w:t xml:space="preserve">that changes according to the logged-in role, styled with the Bootstrap 5 framework and a small custom stylesheet.</w:t>
       </w:r>
     </w:p>
     <w:p>

</xml_diff>

<commit_message>
Sync report with delivered system: ER diagram, 10 tables, new FRs and test cases
Insert the ER diagram (Figure 4.2), correct table count from eight to ten,
document notifications/audit/analytics/exports/API as FR-18..22 and NFR-9,
add routes and test cases 18-24, add results sections for the new features,
and rewrite the conclusion and limitations to describe a completed system.

Co-Authored-By: Claude Fable 5 <noreply@anthropic.com>
Claude-Session: https://claude.ai/code/session_013xPLnyFTSjbxMiATP4c7ND
</commit_message>
<xml_diff>
--- a/docs/Project_Documentation.docx
+++ b/docs/Project_Documentation.docx
@@ -2873,6 +2873,116 @@
       </w:r>
       <w:r>
         <w:t xml:space="preserve">The system shall allow internships to be searched by keyword (title, description, skills) and filtered by skill.</w:t>
+      </w:r>
+    </w:p>
+    <w:p>
+      <w:pPr>
+        <w:numPr>
+          <w:ilvl w:val="0"/>
+          <w:numId w:val="1008"/>
+        </w:numPr>
+        <w:pStyle w:val="Compact"/>
+      </w:pPr>
+      <w:r>
+        <w:rPr>
+          <w:bCs/>
+          <w:b/>
+        </w:rPr>
+        <w:t xml:space="preserve">FR-18:</w:t>
+      </w:r>
+      <w:r>
+        <w:t xml:space="preserve"> </w:t>
+      </w:r>
+      <w:r>
+        <w:t xml:space="preserve">The system shall notify users of events relevant to their role and show the number of unread notifications.</w:t>
+      </w:r>
+    </w:p>
+    <w:p>
+      <w:pPr>
+        <w:numPr>
+          <w:ilvl w:val="0"/>
+          <w:numId w:val="1008"/>
+        </w:numPr>
+        <w:pStyle w:val="Compact"/>
+      </w:pPr>
+      <w:r>
+        <w:rPr>
+          <w:bCs/>
+          <w:b/>
+        </w:rPr>
+        <w:t xml:space="preserve">FR-19:</w:t>
+      </w:r>
+      <w:r>
+        <w:t xml:space="preserve"> </w:t>
+      </w:r>
+      <w:r>
+        <w:t xml:space="preserve">The system shall record an audit entry for important actions and let the administrator review them.</w:t>
+      </w:r>
+    </w:p>
+    <w:p>
+      <w:pPr>
+        <w:numPr>
+          <w:ilvl w:val="0"/>
+          <w:numId w:val="1008"/>
+        </w:numPr>
+        <w:pStyle w:val="Compact"/>
+      </w:pPr>
+      <w:r>
+        <w:rPr>
+          <w:bCs/>
+          <w:b/>
+        </w:rPr>
+        <w:t xml:space="preserve">FR-20:</w:t>
+      </w:r>
+      <w:r>
+        <w:t xml:space="preserve"> </w:t>
+      </w:r>
+      <w:r>
+        <w:t xml:space="preserve">The system shall present each role a dashboard with key performance indicators and charts.</w:t>
+      </w:r>
+    </w:p>
+    <w:p>
+      <w:pPr>
+        <w:numPr>
+          <w:ilvl w:val="0"/>
+          <w:numId w:val="1008"/>
+        </w:numPr>
+        <w:pStyle w:val="Compact"/>
+      </w:pPr>
+      <w:r>
+        <w:rPr>
+          <w:bCs/>
+          <w:b/>
+        </w:rPr>
+        <w:t xml:space="preserve">FR-21:</w:t>
+      </w:r>
+      <w:r>
+        <w:t xml:space="preserve"> </w:t>
+      </w:r>
+      <w:r>
+        <w:t xml:space="preserve">The administrator shall be able to search, page through, and export the user list; a company shall be able to export applicants as CSV.</w:t>
+      </w:r>
+    </w:p>
+    <w:p>
+      <w:pPr>
+        <w:numPr>
+          <w:ilvl w:val="0"/>
+          <w:numId w:val="1008"/>
+        </w:numPr>
+        <w:pStyle w:val="Compact"/>
+      </w:pPr>
+      <w:r>
+        <w:rPr>
+          <w:bCs/>
+          <w:b/>
+        </w:rPr>
+        <w:t xml:space="preserve">FR-22:</w:t>
+      </w:r>
+      <w:r>
+        <w:t xml:space="preserve"> </w:t>
+      </w:r>
+      <w:r>
+        <w:t xml:space="preserve">The system shall expose a JSON REST API for system statistics and open internships.</w:t>
       </w:r>
     </w:p>
     <w:bookmarkEnd w:id="41"/>
@@ -9111,7 +9221,7 @@
         <w:pStyle w:val="Compact"/>
       </w:pPr>
       <w:r>
-        <w:t xml:space="preserve">No email notifications when an applicant is selected.</w:t>
+        <w:t xml:space="preserve">Notifications are in-app only; email and SMS delivery are not implemented.</w:t>
       </w:r>
     </w:p>
     <w:p>

</xml_diff>

<commit_message>
Add college entity and partner directory on the landing page
New colleges table with students linked to a college at registration and an
admin page to add or remove colleges (students keep their accounts when a
college is removed). The landing page now lists the companies working with
the portal, with their open internship counts, and the participating
colleges with their student counts. Adds TC-25 and TC-26, updates the demo
data and documentation.

Co-Authored-By: Claude Fable 5 <noreply@anthropic.com>
Claude-Session: https://claude.ai/code/session_013xPLnyFTSjbxMiATP4c7ND
</commit_message>
<xml_diff>
--- a/docs/Project_Documentation.docx
+++ b/docs/Project_Documentation.docx
@@ -2983,6 +2983,50 @@
       </w:r>
       <w:r>
         <w:t xml:space="preserve">The system shall expose a JSON REST API for system statistics and open internships.</w:t>
+      </w:r>
+    </w:p>
+    <w:p>
+      <w:pPr>
+        <w:numPr>
+          <w:ilvl w:val="0"/>
+          <w:numId w:val="1008"/>
+        </w:numPr>
+        <w:pStyle w:val="Compact"/>
+      </w:pPr>
+      <w:r>
+        <w:rPr>
+          <w:bCs/>
+          <w:b/>
+        </w:rPr>
+        <w:t xml:space="preserve">FR-23:</w:t>
+      </w:r>
+      <w:r>
+        <w:t xml:space="preserve"> </w:t>
+      </w:r>
+      <w:r>
+        <w:t xml:space="preserve">A student shall select their college at registration, and the administrator shall be able to add or remove colleges.</w:t>
+      </w:r>
+    </w:p>
+    <w:p>
+      <w:pPr>
+        <w:numPr>
+          <w:ilvl w:val="0"/>
+          <w:numId w:val="1008"/>
+        </w:numPr>
+        <w:pStyle w:val="Compact"/>
+      </w:pPr>
+      <w:r>
+        <w:rPr>
+          <w:bCs/>
+          <w:b/>
+        </w:rPr>
+        <w:t xml:space="preserve">FR-24:</w:t>
+      </w:r>
+      <w:r>
+        <w:t xml:space="preserve"> </w:t>
+      </w:r>
+      <w:r>
+        <w:t xml:space="preserve">The public landing page shall list the participating companies and colleges.</w:t>
       </w:r>
     </w:p>
     <w:bookmarkEnd w:id="41"/>

</xml_diff>

<commit_message>
Require admin verification for student, company and supervisor accounts
New accounts start pending. Until the admin approves them a student cannot
apply, a company cannot post internships and a supervisor cannot give
feedback; each attempt explains why. The admin gets a verification queue
filtered by pending, approved and rejected, showing the applicant details and
the student's uploaded document, and can approve or reject with a reason. The
decision notifies the user and is written to the audit log. A banner tells
pending and rejected users their state.

Adds test case 28 (five tests), FR-25 and FR-26, the verification columns in
the ER diagram and report, and demo data covering all three states.

Co-Authored-By: Claude Fable 5 <noreply@anthropic.com>
Claude-Session: https://claude.ai/code/session_013xPLnyFTSjbxMiATP4c7ND
</commit_message>
<xml_diff>
--- a/docs/Project_Documentation.docx
+++ b/docs/Project_Documentation.docx
@@ -3027,6 +3027,50 @@
       </w:r>
       <w:r>
         <w:t xml:space="preserve">The public landing page shall list the participating companies and colleges.</w:t>
+      </w:r>
+    </w:p>
+    <w:p>
+      <w:pPr>
+        <w:numPr>
+          <w:ilvl w:val="0"/>
+          <w:numId w:val="1008"/>
+        </w:numPr>
+        <w:pStyle w:val="Compact"/>
+      </w:pPr>
+      <w:r>
+        <w:rPr>
+          <w:bCs/>
+          <w:b/>
+        </w:rPr>
+        <w:t xml:space="preserve">FR-25:</w:t>
+      </w:r>
+      <w:r>
+        <w:t xml:space="preserve"> </w:t>
+      </w:r>
+      <w:r>
+        <w:t xml:space="preserve">New accounts shall start pending and be unable to perform their main actions until the administrator approves them.</w:t>
+      </w:r>
+    </w:p>
+    <w:p>
+      <w:pPr>
+        <w:numPr>
+          <w:ilvl w:val="0"/>
+          <w:numId w:val="1008"/>
+        </w:numPr>
+        <w:pStyle w:val="Compact"/>
+      </w:pPr>
+      <w:r>
+        <w:rPr>
+          <w:bCs/>
+          <w:b/>
+        </w:rPr>
+        <w:t xml:space="preserve">FR-26:</w:t>
+      </w:r>
+      <w:r>
+        <w:t xml:space="preserve"> </w:t>
+      </w:r>
+      <w:r>
+        <w:t xml:space="preserve">The administrator shall approve or reject accounts with a reason, and the user shall be notified.</w:t>
       </w:r>
     </w:p>
     <w:bookmarkEnd w:id="41"/>

</xml_diff>

<commit_message>
Remove the dashboard charts
The dashboards now show only the key figures for each role. The Chart.js
library and its rendering code are removed, along with the chart references
in the report, README and viva sheet, and the affected screenshots retaken.

Co-Authored-By: Claude Fable 5 <noreply@anthropic.com>
Claude-Session: https://claude.ai/code/session_013xPLnyFTSjbxMiATP4c7ND
</commit_message>
<xml_diff>
--- a/docs/Project_Documentation.docx
+++ b/docs/Project_Documentation.docx
@@ -2343,6 +2343,28 @@
           <w:bCs/>
           <w:b/>
         </w:rPr>
+        <w:t xml:space="preserve">Bootstrap Icons</w:t>
+      </w:r>
+      <w:r>
+        <w:t xml:space="preserve"> </w:t>
+      </w:r>
+      <w:r>
+        <w:t xml:space="preserve">— icons on buttons and navigation, also served locally.</w:t>
+      </w:r>
+    </w:p>
+    <w:p>
+      <w:pPr>
+        <w:numPr>
+          <w:ilvl w:val="0"/>
+          <w:numId w:val="1006"/>
+        </w:numPr>
+        <w:pStyle w:val="Compact"/>
+      </w:pPr>
+      <w:r>
+        <w:rPr>
+          <w:bCs/>
+          <w:b/>
+        </w:rPr>
         <w:t xml:space="preserve">CSS</w:t>
       </w:r>
       <w:r>
@@ -2938,7 +2960,7 @@
         <w:t xml:space="preserve"> </w:t>
       </w:r>
       <w:r>
-        <w:t xml:space="preserve">The system shall present each role a dashboard with key performance indicators and charts.</w:t>
+        <w:t xml:space="preserve">The system shall present each role a dashboard with the figures relevant to that role.</w:t>
       </w:r>
     </w:p>
     <w:p>

</xml_diff>

<commit_message>
Remove the REST API
The JSON endpoints and routes/api.py are removed, together with their test
file and the CSRF test that checked them. The requirements and test cases in
the report are renumbered so there are no gaps: FR-1 to FR-25 and 27 test
cases. README, documentation and viva sheet updated to match.

Co-Authored-By: Claude Fable 5 <noreply@anthropic.com>
Claude-Session: https://claude.ai/code/session_013xPLnyFTSjbxMiATP4c7ND
</commit_message>
<xml_diff>
--- a/docs/Project_Documentation.docx
+++ b/docs/Project_Documentation.docx
@@ -2983,28 +2983,6 @@
       </w:r>
       <w:r>
         <w:t xml:space="preserve">The administrator shall be able to search, page through, and export the user list; a company shall be able to export applicants as CSV.</w:t>
-      </w:r>
-    </w:p>
-    <w:p>
-      <w:pPr>
-        <w:numPr>
-          <w:ilvl w:val="0"/>
-          <w:numId w:val="1008"/>
-        </w:numPr>
-        <w:pStyle w:val="Compact"/>
-      </w:pPr>
-      <w:r>
-        <w:rPr>
-          <w:bCs/>
-          <w:b/>
-        </w:rPr>
-        <w:t xml:space="preserve">FR-22:</w:t>
-      </w:r>
-      <w:r>
-        <w:t xml:space="preserve"> </w:t>
-      </w:r>
-      <w:r>
-        <w:t xml:space="preserve">The system shall expose a JSON REST API for system statistics and open internships.</w:t>
       </w:r>
     </w:p>
     <w:p>

</xml_diff>